<commit_message>
Track castle.ff with Git LFS
</commit_message>
<xml_diff>
--- a/iw5/berlin.docx
+++ b/iw5/berlin.docx
@@ -20,11 +20,51 @@
           <w:szCs w:val="28"/>
           <w:lang w:val="en-US"/>
         </w:rPr>
-        <w:t>Berlin.ff</w:t>
+        <w:t>*</w:t>
+      </w:r>
+      <w:r>
+        <w:rPr>
+          <w:b/>
+          <w:bCs/>
+          <w:sz w:val="28"/>
+          <w:szCs w:val="28"/>
+          <w:lang w:val="en-US"/>
+        </w:rPr>
+        <w:t>.</w:t>
+      </w:r>
+      <w:proofErr w:type="spellStart"/>
+      <w:r>
+        <w:rPr>
+          <w:b/>
+          <w:bCs/>
+          <w:sz w:val="28"/>
+          <w:szCs w:val="28"/>
+          <w:lang w:val="en-US"/>
+        </w:rPr>
+        <w:t>ff</w:t>
+      </w:r>
+      <w:proofErr w:type="spellEnd"/>
+    </w:p>
+    <w:p>
+      <w:pPr>
+        <w:rPr>
+          <w:lang w:val="en-US"/>
+        </w:rPr>
+      </w:pPr>
+      <w:r>
+        <w:rPr>
+          <w:lang w:val="en-US"/>
+        </w:rPr>
+        <w:t>Modified the script so that:</w:t>
       </w:r>
     </w:p>
     <w:p>
       <w:pPr>
+        <w:pStyle w:val="ListParagraph"/>
+        <w:numPr>
+          <w:ilvl w:val="0"/>
+          <w:numId w:val="2"/>
+        </w:numPr>
         <w:rPr>
           <w:lang w:val="en-US"/>
         </w:rPr>
@@ -33,8 +73,28 @@
         <w:rPr>
           <w:lang w:val="en-US"/>
         </w:rPr>
-        <w:t>It makes many of the enemy soldiers take our side. Other enemy soldiers which act hostile are armed with a very simple pistols.</w:t>
+        <w:t>Many enemy soldiers are on our side</w:t>
       </w:r>
+    </w:p>
+    <w:p>
+      <w:pPr>
+        <w:pStyle w:val="ListParagraph"/>
+        <w:numPr>
+          <w:ilvl w:val="0"/>
+          <w:numId w:val="2"/>
+        </w:numPr>
+        <w:rPr>
+          <w:lang w:val="en-US"/>
+        </w:rPr>
+      </w:pPr>
+      <w:r>
+        <w:rPr>
+          <w:lang w:val="en-US"/>
+        </w:rPr>
+        <w:t>Enemy soldiers mostly own nothing but a simple pistol as weapon</w:t>
+      </w:r>
+      <w:bookmarkStart w:id="0" w:name="_GoBack"/>
+      <w:bookmarkEnd w:id="0"/>
     </w:p>
     <w:p>
       <w:pPr>
@@ -64,7 +124,19 @@
         <w:rPr>
           <w:lang w:val="en-US"/>
         </w:rPr>
-        <w:t>String messages are disorganized</w:t>
+        <w:t xml:space="preserve">String messages </w:t>
+      </w:r>
+      <w:r>
+        <w:rPr>
+          <w:lang w:val="en-US"/>
+        </w:rPr>
+        <w:t>might be</w:t>
+      </w:r>
+      <w:r>
+        <w:rPr>
+          <w:lang w:val="en-US"/>
+        </w:rPr>
+        <w:t xml:space="preserve"> disorganized</w:t>
       </w:r>
     </w:p>
     <w:p>
@@ -100,8 +172,6 @@
           <w:lang w:val="en-US"/>
         </w:rPr>
       </w:pPr>
-      <w:bookmarkStart w:id="0" w:name="_GoBack"/>
-      <w:bookmarkEnd w:id="0"/>
     </w:p>
     <w:sectPr>
       <w:pgSz w:w="11906" w:h="16838"/>
@@ -116,6 +186,118 @@
 <file path=word/numbering.xml><?xml version="1.0" encoding="utf-8"?>
 <w:numbering xmlns:wpc="http://schemas.microsoft.com/office/word/2010/wordprocessingCanvas" xmlns:cx="http://schemas.microsoft.com/office/drawing/2014/chartex" xmlns:cx1="http://schemas.microsoft.com/office/drawing/2015/9/8/chartex" xmlns:mc="http://schemas.openxmlformats.org/markup-compatibility/2006" xmlns:o="urn:schemas-microsoft-com:office:office" xmlns:r="http://schemas.openxmlformats.org/officeDocument/2006/relationships" xmlns:m="http://schemas.openxmlformats.org/officeDocument/2006/math" xmlns:v="urn:schemas-microsoft-com:vml" xmlns:wp14="http://schemas.microsoft.com/office/word/2010/wordprocessingDrawing" xmlns:wp="http://schemas.openxmlformats.org/drawingml/2006/wordprocessingDrawing" xmlns:w10="urn:schemas-microsoft-com:office:word" xmlns:w="http://schemas.openxmlformats.org/wordprocessingml/2006/main" xmlns:w14="http://schemas.microsoft.com/office/word/2010/wordml" xmlns:w15="http://schemas.microsoft.com/office/word/2012/wordml" xmlns:w16se="http://schemas.microsoft.com/office/word/2015/wordml/symex" xmlns:wpg="http://schemas.microsoft.com/office/word/2010/wordprocessingGroup" xmlns:wpi="http://schemas.microsoft.com/office/word/2010/wordprocessingInk" xmlns:wne="http://schemas.microsoft.com/office/word/2006/wordml" xmlns:wps="http://schemas.microsoft.com/office/word/2010/wordprocessingShape" mc:Ignorable="w14 w15 w16se wp14">
   <w:abstractNum w:abstractNumId="0" w15:restartNumberingAfterBreak="0">
+    <w:nsid w:val="2DFF4DD6"/>
+    <w:multiLevelType w:val="hybridMultilevel"/>
+    <w:tmpl w:val="B7305178"/>
+    <w:lvl w:ilvl="0" w:tplc="185E552A">
+      <w:numFmt w:val="bullet"/>
+      <w:lvlText w:val=""/>
+      <w:lvlJc w:val="left"/>
+      <w:pPr>
+        <w:ind w:left="720" w:hanging="360"/>
+      </w:pPr>
+      <w:rPr>
+        <w:rFonts w:ascii="Symbol" w:eastAsiaTheme="minorHAnsi" w:hAnsi="Symbol" w:cstheme="minorBidi" w:hint="default"/>
+      </w:rPr>
+    </w:lvl>
+    <w:lvl w:ilvl="1" w:tplc="04090003" w:tentative="1">
+      <w:start w:val="1"/>
+      <w:numFmt w:val="bullet"/>
+      <w:lvlText w:val="o"/>
+      <w:lvlJc w:val="left"/>
+      <w:pPr>
+        <w:ind w:left="1440" w:hanging="360"/>
+      </w:pPr>
+      <w:rPr>
+        <w:rFonts w:ascii="Courier New" w:hAnsi="Courier New" w:cs="Courier New" w:hint="default"/>
+      </w:rPr>
+    </w:lvl>
+    <w:lvl w:ilvl="2" w:tplc="04090005" w:tentative="1">
+      <w:start w:val="1"/>
+      <w:numFmt w:val="bullet"/>
+      <w:lvlText w:val=""/>
+      <w:lvlJc w:val="left"/>
+      <w:pPr>
+        <w:ind w:left="2160" w:hanging="360"/>
+      </w:pPr>
+      <w:rPr>
+        <w:rFonts w:ascii="Wingdings" w:hAnsi="Wingdings" w:hint="default"/>
+      </w:rPr>
+    </w:lvl>
+    <w:lvl w:ilvl="3" w:tplc="04090001" w:tentative="1">
+      <w:start w:val="1"/>
+      <w:numFmt w:val="bullet"/>
+      <w:lvlText w:val=""/>
+      <w:lvlJc w:val="left"/>
+      <w:pPr>
+        <w:ind w:left="2880" w:hanging="360"/>
+      </w:pPr>
+      <w:rPr>
+        <w:rFonts w:ascii="Symbol" w:hAnsi="Symbol" w:hint="default"/>
+      </w:rPr>
+    </w:lvl>
+    <w:lvl w:ilvl="4" w:tplc="04090003" w:tentative="1">
+      <w:start w:val="1"/>
+      <w:numFmt w:val="bullet"/>
+      <w:lvlText w:val="o"/>
+      <w:lvlJc w:val="left"/>
+      <w:pPr>
+        <w:ind w:left="3600" w:hanging="360"/>
+      </w:pPr>
+      <w:rPr>
+        <w:rFonts w:ascii="Courier New" w:hAnsi="Courier New" w:cs="Courier New" w:hint="default"/>
+      </w:rPr>
+    </w:lvl>
+    <w:lvl w:ilvl="5" w:tplc="04090005" w:tentative="1">
+      <w:start w:val="1"/>
+      <w:numFmt w:val="bullet"/>
+      <w:lvlText w:val=""/>
+      <w:lvlJc w:val="left"/>
+      <w:pPr>
+        <w:ind w:left="4320" w:hanging="360"/>
+      </w:pPr>
+      <w:rPr>
+        <w:rFonts w:ascii="Wingdings" w:hAnsi="Wingdings" w:hint="default"/>
+      </w:rPr>
+    </w:lvl>
+    <w:lvl w:ilvl="6" w:tplc="04090001" w:tentative="1">
+      <w:start w:val="1"/>
+      <w:numFmt w:val="bullet"/>
+      <w:lvlText w:val=""/>
+      <w:lvlJc w:val="left"/>
+      <w:pPr>
+        <w:ind w:left="5040" w:hanging="360"/>
+      </w:pPr>
+      <w:rPr>
+        <w:rFonts w:ascii="Symbol" w:hAnsi="Symbol" w:hint="default"/>
+      </w:rPr>
+    </w:lvl>
+    <w:lvl w:ilvl="7" w:tplc="04090003" w:tentative="1">
+      <w:start w:val="1"/>
+      <w:numFmt w:val="bullet"/>
+      <w:lvlText w:val="o"/>
+      <w:lvlJc w:val="left"/>
+      <w:pPr>
+        <w:ind w:left="5760" w:hanging="360"/>
+      </w:pPr>
+      <w:rPr>
+        <w:rFonts w:ascii="Courier New" w:hAnsi="Courier New" w:cs="Courier New" w:hint="default"/>
+      </w:rPr>
+    </w:lvl>
+    <w:lvl w:ilvl="8" w:tplc="04090005" w:tentative="1">
+      <w:start w:val="1"/>
+      <w:numFmt w:val="bullet"/>
+      <w:lvlText w:val=""/>
+      <w:lvlJc w:val="left"/>
+      <w:pPr>
+        <w:ind w:left="6480" w:hanging="360"/>
+      </w:pPr>
+      <w:rPr>
+        <w:rFonts w:ascii="Wingdings" w:hAnsi="Wingdings" w:hint="default"/>
+      </w:rPr>
+    </w:lvl>
+  </w:abstractNum>
+  <w:abstractNum w:abstractNumId="1" w15:restartNumberingAfterBreak="0">
     <w:nsid w:val="3AE17E40"/>
     <w:multiLevelType w:val="hybridMultilevel"/>
     <w:tmpl w:val="F33AAD7C"/>
@@ -205,6 +387,9 @@
     </w:lvl>
   </w:abstractNum>
   <w:num w:numId="1">
+    <w:abstractNumId w:val="1"/>
+  </w:num>
+  <w:num w:numId="2">
     <w:abstractNumId w:val="0"/>
   </w:num>
 </w:numbering>

</xml_diff>

<commit_message>
Milehigh jack from solo play added
</commit_message>
<xml_diff>
--- a/iw5/berlin.docx
+++ b/iw5/berlin.docx
@@ -93,8 +93,6 @@
         </w:rPr>
         <w:t>Enemy soldiers mostly own nothing but a simple pistol as weapon</w:t>
       </w:r>
-      <w:bookmarkStart w:id="0" w:name="_GoBack"/>
-      <w:bookmarkEnd w:id="0"/>
     </w:p>
     <w:p>
       <w:pPr>
@@ -172,6 +170,166 @@
           <w:lang w:val="en-US"/>
         </w:rPr>
       </w:pPr>
+    </w:p>
+    <w:p>
+      <w:pPr>
+        <w:rPr>
+          <w:lang w:val="en-US"/>
+        </w:rPr>
+      </w:pPr>
+    </w:p>
+    <w:p>
+      <w:pPr>
+        <w:rPr>
+          <w:lang w:val="en-US"/>
+        </w:rPr>
+      </w:pPr>
+      <w:r>
+        <w:rPr>
+          <w:lang w:val="en-US"/>
+        </w:rPr>
+        <w:t>Corresponding levels:</w:t>
+      </w:r>
+    </w:p>
+    <w:p>
+      <w:pPr>
+        <w:pStyle w:val="ListParagraph"/>
+        <w:numPr>
+          <w:ilvl w:val="0"/>
+          <w:numId w:val="2"/>
+        </w:numPr>
+        <w:rPr>
+          <w:lang w:val="en-US"/>
+        </w:rPr>
+      </w:pPr>
+      <w:r>
+        <w:rPr>
+          <w:lang w:val="en-US"/>
+        </w:rPr>
+        <w:t xml:space="preserve">berlin.ff for </w:t>
+      </w:r>
+      <w:r>
+        <w:rPr>
+          <w:i/>
+          <w:iCs/>
+          <w:color w:val="FF0000"/>
+          <w:lang w:val="en-US"/>
+        </w:rPr>
+        <w:t>SCORCHED EARTH</w:t>
+      </w:r>
+    </w:p>
+    <w:p>
+      <w:pPr>
+        <w:pStyle w:val="ListParagraph"/>
+        <w:numPr>
+          <w:ilvl w:val="0"/>
+          <w:numId w:val="2"/>
+        </w:numPr>
+        <w:rPr>
+          <w:lang w:val="en-US"/>
+        </w:rPr>
+      </w:pPr>
+      <w:r>
+        <w:rPr>
+          <w:lang w:val="en-US"/>
+        </w:rPr>
+        <w:t>cas</w:t>
+      </w:r>
+      <w:r>
+        <w:rPr>
+          <w:lang w:val="en-US"/>
+        </w:rPr>
+        <w:t>tle.ff for</w:t>
+      </w:r>
+      <w:r>
+        <w:rPr>
+          <w:color w:val="FF0000"/>
+          <w:lang w:val="en-US"/>
+        </w:rPr>
+        <w:t xml:space="preserve"> STRONGHOLD</w:t>
+      </w:r>
+    </w:p>
+    <w:p>
+      <w:pPr>
+        <w:pStyle w:val="ListParagraph"/>
+        <w:numPr>
+          <w:ilvl w:val="0"/>
+          <w:numId w:val="2"/>
+        </w:numPr>
+        <w:rPr>
+          <w:lang w:val="en-US"/>
+        </w:rPr>
+      </w:pPr>
+      <w:r>
+        <w:rPr>
+          <w:lang w:val="en-US"/>
+        </w:rPr>
+        <w:t>so_milehigh_hijack</w:t>
+      </w:r>
+      <w:r>
+        <w:rPr>
+          <w:lang w:val="en-US"/>
+        </w:rPr>
+        <w:t xml:space="preserve">.ff for </w:t>
+      </w:r>
+      <w:r>
+        <w:rPr>
+          <w:i/>
+          <w:iCs/>
+          <w:lang w:val="en-US"/>
+        </w:rPr>
+        <w:t xml:space="preserve">special OPS </w:t>
+      </w:r>
+      <w:r>
+        <w:rPr>
+          <w:i/>
+          <w:iCs/>
+          <w:lang w:val="en-US"/>
+        </w:rPr>
+        <w:sym w:font="Wingdings" w:char="F0E0"/>
+      </w:r>
+      <w:r>
+        <w:rPr>
+          <w:i/>
+          <w:iCs/>
+          <w:lang w:val="en-US"/>
+        </w:rPr>
+        <w:t xml:space="preserve"> solo play </w:t>
+      </w:r>
+      <w:r>
+        <w:rPr>
+          <w:i/>
+          <w:iCs/>
+          <w:lang w:val="en-US"/>
+        </w:rPr>
+        <w:sym w:font="Wingdings" w:char="F0E0"/>
+      </w:r>
+      <w:r>
+        <w:rPr>
+          <w:i/>
+          <w:iCs/>
+          <w:lang w:val="en-US"/>
+        </w:rPr>
+        <w:t xml:space="preserve"> missions </w:t>
+      </w:r>
+      <w:r>
+        <w:rPr>
+          <w:i/>
+          <w:iCs/>
+          <w:lang w:val="en-US"/>
+        </w:rPr>
+        <w:sym w:font="Wingdings" w:char="F0E0"/>
+      </w:r>
+      <w:r>
+        <w:rPr>
+          <w:i/>
+          <w:iCs/>
+          <w:lang w:val="en-US"/>
+        </w:rPr>
+        <w:t xml:space="preserve"> MILEHIGH JACK</w:t>
+      </w:r>
+      <w:bookmarkStart w:id="0" w:name="_GoBack"/>
+      <w:bookmarkEnd w:id="0"/>
     </w:p>
     <w:sectPr>
       <w:pgSz w:w="11906" w:h="16838"/>

</xml_diff>